<commit_message>
docs(paper): precise supervised-ceiling claim + Scenario-2/sequence-AE future work
Aligns the full paper with the technical report: tightens 'roughly 90% of
supervised accuracy' to '~99% of a stacking ensemble AUROC (0.980) and ~90% of
its F1', and adds the Scenario-2 under-detection limitation plus the planned
sequence/Transformer autoencoder as the main future-work direction.
</commit_message>
<xml_diff>
--- a/Argus_UEBA_Full_Paper.docx
+++ b/Argus_UEBA_Full_Paper.docx
@@ -130,7 +130,7 @@
         <w:t>features. The final detector is a deep autoencoder trained only on normal user-days; its reconstruction error is the risk score, while an Isolation Forest, a rule scorer and a six-signal rarity scorer (including a geo-rarity flag derived from Cloudflare country data) are retained as interpretable baselines. Every alert is explained through SHAP feature attribution and a natural-language large-language-model assistant. On the CERT r4.2 benchmark (1,000 users, 70 insiders) the autoencoder attains AUROC 0.976,</w:t>
       </w:r>
       <w:r>
-        <w:t xml:space="preserve"> AUPRC 0.851 and F1 0.787 — roughly 90% of supervised accuracy with zero labels — decisively outperforming the rule and isolation baselines. External validity is demonstrated on the </w:t>
+        <w:t xml:space="preserve"> AUPRC 0.851 and F1 0.787 — within ~99% of a supervised stacking ensemble's AUROC (0.980) and ~90% of its F1, with zero labels — decisively outperforming the rule and isolation baselines. External validity is demonstrated on the </w:t>
       </w:r>
       <w:proofErr w:type="spellStart"/>
       <w:proofErr w:type="gramStart"/>
@@ -2289,7 +2289,7 @@
       </w:r>
       <w:proofErr w:type="spellEnd"/>
       <w:r>
-        <w:t xml:space="preserve"> means Argus needs no labelled attacks, which are scarce and quickly stale in practice; yet it reaches roughly 90% of supervised accuracy. The rarity signals and SHAP attribution give analysts an immediate, human-readable rationale for each alert — a capability absent from every open-source tool evaluated — and the LLM assistant lowers cognitive load by narrating that rationale in plain language. The source-agnostic </w:t>
+        <w:t xml:space="preserve"> means Argus needs no labelled attacks, which are scarce and quickly stale in practice; yet it reaches roughly 99% of a supervised stacking ensemble's AUROC (0.980) and 90% of its F1. The rarity signals and SHAP attribution give analysts an immediate, human-readable rationale for each alert — a capability absent from every open-source tool evaluated — and the LLM assistant lowers cognitive load by narrating that rationale in plain language. The source-agnostic </w:t>
       </w:r>
       <w:proofErr w:type="spellStart"/>
       <w:r>
@@ -2326,7 +2326,7 @@
       <w:proofErr w:type="spellEnd"/>
       <w:proofErr w:type="gramEnd"/>
       <w:r>
-        <w:t xml:space="preserve"> and live-replay results mitigate but do not fully remove this concern. The system does not yet detect model drift as legitimate </w:t>
+        <w:t xml:space="preserve"> and live-replay results mitigate but do not fully remove this concern. Detection is also uneven across the three CERT insider scenarios: the autoencoder recovers the burst-like Scenario 1 (30/30) and Scenario 3 (10/10) but only the low-and-slow Scenario 2 (12/30), which a supervised stacking ensemble detects (27/30) — the signal is present in the features but missed by the per-day reconstruction objective. The principal planned extension is therefore a sequence / Transformer autoencoder over each user's daily timeline, modelling gradual temporal drift rather than single-day aggregates; an initial prototype did not yet improve Scenario 2 detection, plausibly constrained by only 70 insider entities, and remains the main direction for future work. The system does not yet detect model drift as legitimate </w:t>
       </w:r>
       <w:proofErr w:type="spellStart"/>
       <w:r>

</xml_diff>

<commit_message>
docs(paper): post-viva accuracy pass for FYP1 report submission
- Remove the '30-day rolling window' claims (not implemented; features are
  per-user mean/max/sum aggregates + burst ratios + K-Means peer ratios) -
  abstract, methodology, and OpenUBA comparison now match the actual code.
- Add the five-fold inductive cross-validation result (AUROC 0.959 +/- 0.004)
  to Detector Performance.
- Add the GitHub semi-synthetic evaluation (AUROC 0.992) as a third external
  check in Real-World Validation.
- Name Dr. Firdaus Sahran and ECLOGIC Sdn Bhd (Mohd Akbar bin Abu Bakar) in
  the Acknowledgments.
</commit_message>
<xml_diff>
--- a/Argus_UEBA_Full_Paper.docx
+++ b/Argus_UEBA_Full_Paper.docx
@@ -124,10 +124,7 @@
       </w:r>
       <w:proofErr w:type="spellEnd"/>
       <w:r>
-        <w:t xml:space="preserve"> baselines are built from 30-day rolling statistics over 71 engineered </w:t>
-      </w:r>
-      <w:r>
-        <w:t>features. The final detector is a deep autoencoder trained only on normal user-days; its reconstruction error is the risk score, while an Isolation Forest, a rule scorer and a six-signal rarity scorer (including a geo-rarity flag derived from Cloudflare country data) are retained as interpretable baselines. Every alert is explained through SHAP feature attribution and a natural-language large-language-model assistant. On the CERT r4.2 benchmark (1,000 users, 70 insiders) the autoencoder attains AUROC 0.976,</w:t>
+        <w:t xml:space="preserve"> baselines are built from 71 engineered features capturing volume, timing, device, file and communication patterns, contextualised against K-Means behavioural peer groups. The final detector is a deep autoencoder trained only on normal user-days; its reconstruction error is the risk score, while an Isolation Forest, a rule scorer and a six-signal rarity scorer (including a geo-rarity flag derived from Cloudflare country data) are retained as interpretable baselines. Every alert is explained through SHAP feature attribution and a natural-language large-language-model assistant. On the CERT r4.2 benchmark (1,000 users, 70 insiders) the autoencoder attains AUROC 0.976,</w:t>
       </w:r>
       <w:r>
         <w:t xml:space="preserve"> AUPRC 0.851 and F1 0.787 — within ~99% of a supervised stacking ensemble's AUROC (0.980) and ~90% of its F1, with zero labels — decisively outperforming the rule and isolation baselines. External validity is demonstrated on the </w:t>
@@ -419,7 +416,7 @@
       </w:r>
       <w:proofErr w:type="spellEnd"/>
       <w:r>
-        <w:t xml:space="preserve"> offers basic statistical profiling but no per-user rolling baselines, while HELK exposes Elasticsearch machine-learning primitives without a custom training pipeline or explanation layer. None of the evaluated tools </w:t>
+        <w:t xml:space="preserve"> offers basic statistical profiling but no per-user behavioural baselines, while HELK exposes Elasticsearch machine-learning primitives without a custom training pipeline or explanation layer. None of the evaluated tools </w:t>
       </w:r>
       <w:proofErr w:type="spellStart"/>
       <w:r>
@@ -699,26 +696,7 @@
       </w:r>
       <w:proofErr w:type="spellEnd"/>
       <w:r>
-        <w:t xml:space="preserve"> vectors per user. For CERT data, a 71-dimensional feature vector is computed over a 30-day rolling window, capturing volume, timing, device, file and communication patterns; for live cloud data, a compact 12-dimensional per-user-day feature vector is used. A 30-day rolling window yields the per-user mean (μ) and standard deviation (σ) of each feature, and the daily </w:t>
-      </w:r>
-      <w:proofErr w:type="gramStart"/>
-      <w:r>
-        <w:t>deviation z</w:t>
-      </w:r>
-      <w:proofErr w:type="gramEnd"/>
-      <w:r>
-        <w:t xml:space="preserve"> = (x − μ)/σ quantifies how far a user's </w:t>
-      </w:r>
-      <w:proofErr w:type="spellStart"/>
-      <w:r>
-        <w:t>behaviour</w:t>
-      </w:r>
-      <w:proofErr w:type="spellEnd"/>
-      <w:r>
-        <w:t xml:space="preserve"> departs from their own established n</w:t>
-      </w:r>
-      <w:r>
-        <w:t>orm.</w:t>
+        <w:t xml:space="preserve"> vectors per user. For CERT data, daily activity is aggregated into a 71-dimensional per-user vector — the mean, maximum and sum of 21 base behavioural features capturing volume, timing, device, file and communication patterns, augmented with burst ratios (peak-to-average activity spikes) and peer-group ratios; for live cloud data, a compact 12-dimensional per-user-day feature vector is used. K-Means clustering, fitted on normal users only, assigns each user to a behavioural peer group, and per-feature peer ratios quantify how far a user's behaviour departs from the norm of behaviourally similar users.</w:t>
       </w:r>
     </w:p>
     <w:p>
@@ -922,7 +900,7 @@
         <w:pStyle w:val="p1a"/>
       </w:pPr>
       <w:r>
-        <w:t>Table 1 reports AUROC, AUPRC and F1 (at the F1-optimal threshold) for the four configurations on the CERT r4.2 test set. Because insiders are a small minority, AUPRC is reported alongside AUROC, as AUROC alone can overstate performance on imbalanced data. The autoencoder dominates every metric, and the corresponding ROC curves are shown in Fig. 2.</w:t>
+        <w:t>Table 1 reports AUROC, AUPRC and F1 (at the F1-optimal threshold) for the four configurations on the CERT r4.2 test set. Because insiders are a small minority, AUPRC is reported alongside AUROC, as AUROC alone can overstate performance on imbalanced data. The autoencoder dominates every metric, and the corresponding ROC curves are shown in Fig. 2. To rule out transductive optimism, a five-fold inductive cross-validation — retraining the autoencoder on each training fold's normal users and scoring held-out users only — yields AUROC 0.959 ± 0.004, confirming that the headline result generalises to unseen users.</w:t>
       </w:r>
     </w:p>
     <w:p>
@@ -1406,7 +1384,7 @@
         <w:pStyle w:val="p1a"/>
       </w:pPr>
       <w:r>
-        <w:t xml:space="preserve">Benchmarks on simulated data can flatter a detector, so two external checks are performed. First, the cloud feature autoencoder is evaluated on the </w:t>
+        <w:t xml:space="preserve">Benchmarks on simulated data can flatter a detector, so three external checks are performed. First, the cloud feature autoencoder is evaluated on the </w:t>
       </w:r>
       <w:proofErr w:type="spellStart"/>
       <w:proofErr w:type="gramStart"/>
@@ -1432,7 +1410,7 @@
       </w:r>
       <w:proofErr w:type="gramEnd"/>
       <w:r>
-        <w:t xml:space="preserve"> attacker activity from benign API calls at AUROC 0.724 despite being trained without any attack labels. Second, a streaming live-replay drives events through the production /ingest endpoint and scores them online; the live pipeline attains AUROC 0.917 against an offline 0.976, confirming that the real-time path preserves most of the detector's accuracy.</w:t>
+        <w:t xml:space="preserve"> attacker activity from benign API calls at AUROC 0.724 despite being trained without any attack labels. Second, a streaming live-replay drives events through the production /ingest endpoint and scores them online; the live pipeline attains AUROC 0.917 against an offline 0.976, confirming that the real-time path preserves most of the detector's accuracy. Third, a semi-synthetic evaluation on real GitHub activity — 240 genuine users with labelled attacker behaviour injected, following the same construction principle as CERT — yields AUROC 0.992, corroborating that the cloud pipeline separates planted attacks from authentic user behaviour.</w:t>
       </w:r>
     </w:p>
     <w:p>
@@ -2380,7 +2358,7 @@
         <w:pStyle w:val="acknowlegments"/>
       </w:pPr>
       <w:r>
-        <w:t>Acknowledgments. The author thanks the supervisor and the Faculty of Computer Science and Information Technology, Universiti Malaya, for their guidance and support, and Carnegie Mellon University for providing the CERT Insider Threat Dataset.</w:t>
+        <w:t>Acknowledgments. The author thanks Dr. Firdaus Sahran and the Faculty of Computer Science and Information Technology, Universiti Malaya, for their guidance and support; Mohd Akbar bin Abu Bakar (Lead Engineer, ECLOGIC Sdn Bhd) for industry collaboration validating the system's operational relevance; and Carnegie Mellon University for providing the CERT Insider Threat Dataset.</w:t>
       </w:r>
     </w:p>
     <w:p>

</xml_diff>

<commit_message>
docs(paper): fix Fig.1 architecture accuracy + schema enumeration
- Architecture figure: correct the 8-field schema labels to the implemented
  set {timestamp, user, source, action, resource, ip_address, metadata, raw};
  replace the '30-day rolling' feature label with the actual mean/max/sum +
  burst + peer-ratio aggregation; '6 flags incl. geo' (geo is one of the six).
- Swap the paper's Fig. 1 from the logo-styled diagram to the plain academic
  version (corrected), with display extents rescaled to the new aspect ratio.
- Fix Sec. 3.1 body text: schema enumeration now matches the implementation,
  noting metadata preserves source-specific fields and raw keeps the original
  event.
</commit_message>
<xml_diff>
--- a/Argus_UEBA_Full_Paper.docx
+++ b/Argus_UEBA_Full_Paper.docx
@@ -470,7 +470,7 @@
         <w:lastRenderedPageBreak/>
         <w:drawing>
           <wp:inline distT="0" distB="0" distL="0" distR="0" wp14:anchorId="3ADBEACB" wp14:editId="21CB3155">
-            <wp:extent cx="4392930" cy="4298872"/>
+            <wp:extent cx="4392930" cy="3277705"/>
             <wp:effectExtent l="0" t="0" r="0" b="0"/>
             <wp:docPr id="101" name="Figure 101"/>
             <wp:cNvGraphicFramePr>
@@ -492,7 +492,7 @@
                   <pic:spPr>
                     <a:xfrm>
                       <a:off x="0" y="0"/>
-                      <a:ext cx="4392930" cy="4298872"/>
+                      <a:ext cx="4392930" cy="3277705"/>
                     </a:xfrm>
                     <a:prstGeom prst="rect">
                       <a:avLst/>
@@ -635,19 +635,7 @@
       </w:r>
       <w:proofErr w:type="gramEnd"/>
       <w:r>
-        <w:t xml:space="preserve">timestamp, user, action, </w:t>
-      </w:r>
-      <w:proofErr w:type="spellStart"/>
-      <w:r>
-        <w:t>source_ip</w:t>
-      </w:r>
-      <w:proofErr w:type="spellEnd"/>
-      <w:r>
-        <w:t xml:space="preserve">, bytes, resource, country, </w:t>
-      </w:r>
-      <w:proofErr w:type="gramStart"/>
-      <w:r>
-        <w:t>source}.</w:t>
+        <w:t xml:space="preserve">timestamp, user, source, action, resource, ip_address, metadata, raw}, where metadata preserves source-specific fields (e.g. geo-location, Azure conditional-access status) and raw retains the unmodified original event.</w:t>
       </w:r>
       <w:proofErr w:type="gramEnd"/>
     </w:p>

</xml_diff>

<commit_message>
docs(paper): close supervisor-rubric gaps (S1-S3, S6-S7)
- S1: abstract gains a discussion/implication sentence (268 words, <300)
- S2/S3/S6: new intro paragraph with four explicit objectives, scope statement,
  14-week design-build-evaluate schedule, and paper-structure roadmap
- S7: new requirements paragraph (8 FR + 6 NFR + collection method incl.
  ECLOGIC consultation); new Fig. 4 analyst-dashboard screenshot closes the
  interface-design criterion
</commit_message>
<xml_diff>
--- a/Argus_UEBA_Full_Paper.docx
+++ b/Argus_UEBA_Full_Paper.docx
@@ -124,10 +124,7 @@
       </w:r>
       <w:proofErr w:type="spellEnd"/>
       <w:r>
-        <w:t xml:space="preserve"> baselines are built from 71 engineered features capturing volume, timing, device, file and communication patterns, contextualised against K-Means behavioural peer groups. The final detector is a deep autoencoder trained only on normal user-days; its reconstruction error is the risk score, while an Isolation Forest, a rule scorer and a six-signal rarity scorer (including a geo-rarity flag derived from Cloudflare country data) are retained as interpretable baselines. Every alert is explained through SHAP feature attribution and a natural-language large-language-model assistant. On the CERT r4.2 benchmark (1,000 users, 70 insiders) the autoencoder attains AUROC 0.976,</w:t>
-      </w:r>
-      <w:r>
-        <w:t xml:space="preserve"> AUPRC 0.851 and F1 0.787 — within ~99% of a supervised stacking ensemble's AUROC (0.980) and ~90% of its F1, with zero labels — decisively outperforming the rule and isolation baselines. External validity is demonstrated on the </w:t>
+        <w:t xml:space="preserve"> baselines are built from 71 engineered features capturing volume, timing, device, file and communication patterns, contextualised against K-Means behavioural peer groups. The final detector is a deep autoencoder trained only on normal user-days; its reconstruction error is the risk score, while an Isolation Forest, a rule scorer and a six-signal rarity scorer (including a geo-rarity flag derived from Cloudflare country data) are retained as interpretable baselines. Every alert is explained through SHAP feature attribution and a natural-language large-language-model assistant. On the CERT r4.2 benchmark (1,000 users, 70 insiders) the autoencoder attains AUROC 0.976, AUPRC 0.851 and F1 0.787 — within ~99% of a supervised stacking ensemble's AUROC (0.980) and ~90% of its F1, with zero labels — decisively outperforming the rule and isolation baselines. External validity is demonstrated on the </w:t>
       </w:r>
       <w:proofErr w:type="spellStart"/>
       <w:proofErr w:type="gramStart"/>
@@ -153,7 +150,7 @@
       </w:r>
       <w:proofErr w:type="spellEnd"/>
       <w:r>
-        <w:t>.</w:t>
+        <w:t xml:space="preserve">. The results indicate that explainable, label-free insider detection is practical on free-tier infrastructure, with low-and-slow behaviour identified as the principal remaining challenge.</w:t>
       </w:r>
     </w:p>
     <w:p>
@@ -193,7 +190,11 @@
       </w:r>
       <w:proofErr w:type="spellEnd"/>
       <w:r>
-        <w:t xml:space="preserve"> depend. Insider threats — attacks originating from users who already hold legitimate credentials and </w:t>
+        <w:t xml:space="preserve"> depend. </w:t>
+      </w:r>
+      <w:r>
+        <w:lastRenderedPageBreak/>
+        <w:t xml:space="preserve">Insider threats — attacks originating from users who already hold legitimate credentials and </w:t>
       </w:r>
       <w:proofErr w:type="spellStart"/>
       <w:r>
@@ -206,64 +207,204 @@
     </w:p>
     <w:p>
       <w:r>
+        <w:t xml:space="preserve">According to the Verizon 2025 Data Breach Investigations Report, the human element is involved in roughly 60% of </w:t>
+      </w:r>
+      <w:proofErr w:type="gramStart"/>
+      <w:r>
+        <w:t>breaches, and</w:t>
+      </w:r>
+      <w:proofErr w:type="gramEnd"/>
+      <w:r>
+        <w:t xml:space="preserve"> stolen or misused credentials remain the dominant initial-access vector [1]. The </w:t>
+      </w:r>
+      <w:proofErr w:type="spellStart"/>
+      <w:r>
+        <w:t>Ponemon</w:t>
+      </w:r>
+      <w:proofErr w:type="spellEnd"/>
+      <w:r>
+        <w:t xml:space="preserve"> Institute estimates that </w:t>
+      </w:r>
+      <w:proofErr w:type="spellStart"/>
+      <w:r>
+        <w:t>organisations</w:t>
+      </w:r>
+      <w:proofErr w:type="spellEnd"/>
+      <w:r>
+        <w:t xml:space="preserve"> now spend an average of USD 17.4 million per year addressing insider-related risk, a 40% increase since 2019 [2]. Because insiders act within their granted privileges, signature- and rule-based tools such as intrusion-detection systems and SIEM platforms cannot reliably distinguish malicious from benign activity, and they generate excessive false positives when applied across diverse user populations without per-user context.</w:t>
+      </w:r>
+    </w:p>
+    <w:p>
+      <w:r>
+        <w:t xml:space="preserve">User and Entity </w:t>
+      </w:r>
+      <w:proofErr w:type="spellStart"/>
+      <w:r>
+        <w:t>Behaviour</w:t>
+      </w:r>
+      <w:proofErr w:type="spellEnd"/>
+      <w:r>
+        <w:t xml:space="preserve"> Analytics (UEBA) addresses these limitations by modelling each user's normal </w:t>
+      </w:r>
+      <w:proofErr w:type="spellStart"/>
+      <w:r>
+        <w:t>behaviour</w:t>
+      </w:r>
+      <w:proofErr w:type="spellEnd"/>
+      <w:r>
+        <w:t xml:space="preserve"> over time and flagging statistically significant deviations. However, prominent open-source UEBA and SIEM tools — </w:t>
+      </w:r>
+      <w:proofErr w:type="spellStart"/>
+      <w:r>
+        <w:t>Wazuh</w:t>
+      </w:r>
+      <w:proofErr w:type="spellEnd"/>
+      <w:r>
+        <w:t xml:space="preserve">, </w:t>
+      </w:r>
+      <w:proofErr w:type="spellStart"/>
+      <w:r>
+        <w:t>OpenUBA</w:t>
+      </w:r>
+      <w:proofErr w:type="spellEnd"/>
+      <w:r>
+        <w:t xml:space="preserve"> and HELK — remain largely rule-based, operate on a single log source, and provide no explanation for why a user is flagged, leaving analysts with an opaque score and no actionable rationale.</w:t>
+      </w:r>
+    </w:p>
+    <w:p>
+      <w:r>
+        <w:t xml:space="preserve">This paper presents Argus, a cloud-native UEBA platform, and makes four contributions: (1) a </w:t>
+      </w:r>
+      <w:proofErr w:type="spellStart"/>
+      <w:r>
+        <w:t>normalisation</w:t>
+      </w:r>
+      <w:proofErr w:type="spellEnd"/>
+      <w:r>
+        <w:t xml:space="preserve"> layer that unifies four structurally distinct cloud log sources — AWS CloudTrail, Azure AD, Cloudflare Access and GitHub — into one eight-field schema; (2) a label-free detection pipeline whose final detector is a deep autoencoder, complemented by interpretable rarity signals; (3) per-alert explainability combining SHAP attribution with a large-language-model (LLM) analyst assistant; and (4) an evaluation that goes beyond the CERT benchmark to real cloud-breach data and a live streaming replay.</w:t>
+      </w:r>
+    </w:p>
+    <w:p>
+      <w:r>
+        <w:t xml:space="preserve">Four objectives guide the work: (i) to study the limitations of rule-based and open-source UEBA tools; (ii) to design a multi-cloud log-normalisation layer and behavioural-profiling pipeline; (iii) to develop a functional prototype combining autoencoder detection with SHAP per-alert explanations; and (iv) to evaluate the system on CERT r4.2 against rule-based baselines. The scope covers application-layer behavioural logs from the four cloud sources above; packet-level inspection and production-scale streaming are deferred to future work. Development followed an iterative design–build–evaluate cycle over a 14-week schedule. The remainder of this paper is organised as follows: Section 2 reviews related work, Section 3 presents the system design, Section 4 reports the evaluation, Section 5 discusses strengths and limitations, and Section 6 concludes.</w:t>
+      </w:r>
+    </w:p>
+    <w:p>
+      <w:pPr>
+        <w:pStyle w:val="heading1"/>
+      </w:pPr>
+      <w:r>
+        <w:t>Related Work</w:t>
+      </w:r>
+    </w:p>
+    <w:p>
+      <w:pPr>
+        <w:pStyle w:val="p1a"/>
+      </w:pPr>
+      <w:r>
+        <w:t xml:space="preserve">UEBA evolved from earlier User </w:t>
+      </w:r>
+      <w:proofErr w:type="spellStart"/>
+      <w:r>
+        <w:t>Behaviour</w:t>
+      </w:r>
+      <w:proofErr w:type="spellEnd"/>
+      <w:r>
+        <w:t xml:space="preserve"> Analytics systems, broadened to include non-human entities. Gartner </w:t>
+      </w:r>
+      <w:proofErr w:type="spellStart"/>
+      <w:r>
+        <w:t>formalised</w:t>
+      </w:r>
+      <w:proofErr w:type="spellEnd"/>
+      <w:r>
+        <w:t xml:space="preserve"> the category in 2015, </w:t>
+      </w:r>
+      <w:proofErr w:type="spellStart"/>
+      <w:r>
+        <w:t>recognising</w:t>
+      </w:r>
+      <w:proofErr w:type="spellEnd"/>
+      <w:r>
+        <w:t xml:space="preserve"> that monitoring only human activity left significant blind spots in </w:t>
+      </w:r>
+      <w:proofErr w:type="spellStart"/>
+      <w:r>
+        <w:t>organisational</w:t>
+      </w:r>
+      <w:proofErr w:type="spellEnd"/>
+      <w:r>
+        <w:t xml:space="preserve"> security posture [3].</w:t>
+      </w:r>
+    </w:p>
+    <w:p>
+      <w:pPr>
+        <w:pStyle w:val="heading2"/>
+      </w:pPr>
+      <w:r>
+        <w:t>Unsupervised Anomaly Detection</w:t>
+      </w:r>
+    </w:p>
+    <w:p>
+      <w:pPr>
+        <w:pStyle w:val="p1a"/>
+      </w:pPr>
+      <w:r>
+        <w:t xml:space="preserve">Datta et al. demonstrated real-time insider-threat detection with unsupervised learning on the CERT dataset, showing competitive detection without labelled attacks [4]. Liu et al. introduced Isolation Forest, which partitions the feature space at random and isolates anomalies in fewer splits, making it well suited to high-dimensional </w:t>
+      </w:r>
+      <w:proofErr w:type="spellStart"/>
+      <w:r>
+        <w:t>behavioural</w:t>
+      </w:r>
+      <w:proofErr w:type="spellEnd"/>
+      <w:r>
+        <w:t xml:space="preserve"> data [5]. Autoencoder approaches instead learn to reconstruct normal </w:t>
+      </w:r>
+      <w:proofErr w:type="spellStart"/>
+      <w:r>
+        <w:t>behaviour</w:t>
+      </w:r>
+      <w:proofErr w:type="spellEnd"/>
+      <w:r>
+        <w:t>; inputs unseen during training yield elevated reconstruction error that serves directly as an anomaly score [6].</w:t>
+      </w:r>
+    </w:p>
+    <w:p>
+      <w:pPr>
+        <w:pStyle w:val="heading2"/>
+      </w:pPr>
+      <w:r>
         <w:lastRenderedPageBreak/>
-        <w:t xml:space="preserve">According to the Verizon 2025 Data Breach Investigations Report, the human element is involved in roughly 60% of </w:t>
-      </w:r>
-      <w:proofErr w:type="gramStart"/>
-      <w:r>
-        <w:t>breaches, and</w:t>
-      </w:r>
-      <w:proofErr w:type="gramEnd"/>
-      <w:r>
-        <w:t xml:space="preserve"> stolen or misused credentials remain the dominant initial-access vector [1]. The </w:t>
-      </w:r>
-      <w:proofErr w:type="spellStart"/>
-      <w:r>
-        <w:t>Ponemon</w:t>
-      </w:r>
-      <w:proofErr w:type="spellEnd"/>
-      <w:r>
-        <w:t xml:space="preserve"> Institute estimates that </w:t>
-      </w:r>
-      <w:proofErr w:type="spellStart"/>
-      <w:r>
-        <w:t>organisations</w:t>
-      </w:r>
-      <w:proofErr w:type="spellEnd"/>
-      <w:r>
-        <w:t xml:space="preserve"> now spend an average of USD 17.4 million per year addressing insider-related risk, a 40% increase since 2019 [2]. Because insiders act within their granted privileges, signature- and rule-based tools such as intrusion-detection systems and SIEM platforms cannot reliably distinguish malicious from benign activity, and they generate excessive false positives when applie</w:t>
-      </w:r>
-      <w:r>
-        <w:t>d across diverse user populations without per-user context.</w:t>
-      </w:r>
-    </w:p>
-    <w:p>
-      <w:r>
-        <w:t xml:space="preserve">User and Entity </w:t>
-      </w:r>
-      <w:proofErr w:type="spellStart"/>
-      <w:r>
-        <w:t>Behaviour</w:t>
-      </w:r>
-      <w:proofErr w:type="spellEnd"/>
-      <w:r>
-        <w:t xml:space="preserve"> Analytics (UEBA) addresses these limitations by modelling each user's normal </w:t>
-      </w:r>
-      <w:proofErr w:type="spellStart"/>
-      <w:r>
-        <w:t>behaviour</w:t>
-      </w:r>
-      <w:proofErr w:type="spellEnd"/>
-      <w:r>
-        <w:t xml:space="preserve"> over time and flagging statistically significant deviations. However, prominent open-source UEBA and SIEM tools — </w:t>
-      </w:r>
+        <w:t>Explainable AI in Security</w:t>
+      </w:r>
+    </w:p>
+    <w:p>
+      <w:pPr>
+        <w:pStyle w:val="p1a"/>
+      </w:pPr>
+      <w:r>
+        <w:t>Lundberg and Lee proposed SHAP, a unified framework that explains model predictions using Shapley values from cooperative game theory [7]. Applied to intrusion detection, SHAP attributions have been shown to improve analyst trust by exposing each feature's contribution in an interpretable form [8]. The EU AI Act (2024) mandates explainability for high-risk AI systems in security-critical domains, further motivating the integration of explainable AI [9].</w:t>
+      </w:r>
+    </w:p>
+    <w:p>
+      <w:pPr>
+        <w:pStyle w:val="heading2"/>
+      </w:pPr>
+      <w:r>
+        <w:t>Limitations of Existing Tools</w:t>
+      </w:r>
+    </w:p>
+    <w:p>
+      <w:pPr>
+        <w:pStyle w:val="p1a"/>
+      </w:pPr>
       <w:proofErr w:type="spellStart"/>
       <w:r>
         <w:t>Wazuh</w:t>
       </w:r>
       <w:proofErr w:type="spellEnd"/>
       <w:r>
-        <w:t xml:space="preserve">, </w:t>
+        <w:t xml:space="preserve"> encodes its detection logic as static XML rules with no adaptive learning [10]. </w:t>
       </w:r>
       <w:proofErr w:type="spellStart"/>
       <w:r>
@@ -271,12 +412,31 @@
       </w:r>
       <w:proofErr w:type="spellEnd"/>
       <w:r>
-        <w:t xml:space="preserve"> and HELK — remain largely rule-based, operate on a single log source, and provide no explanation for why a user is flagged, leaving analysts with an opaque score and no actionable rationale.</w:t>
-      </w:r>
-    </w:p>
-    <w:p>
-      <w:r>
-        <w:t xml:space="preserve">This paper presents Argus, a cloud-native UEBA platform, and makes four contributions: (1) a </w:t>
+        <w:t xml:space="preserve"> offers basic statistical profiling but no per-user behavioural baselines, while HELK exposes Elasticsearch machine-learning primitives without a custom training pipeline or explanation layer. None of the evaluated tools </w:t>
+      </w:r>
+      <w:proofErr w:type="spellStart"/>
+      <w:r>
+        <w:t>normalise</w:t>
+      </w:r>
+      <w:proofErr w:type="spellEnd"/>
+      <w:r>
+        <w:t xml:space="preserve"> multiple cloud sources or provide per-alert explanations, which is precisely the gap this work addresses.</w:t>
+      </w:r>
+    </w:p>
+    <w:p>
+      <w:pPr>
+        <w:pStyle w:val="heading1"/>
+      </w:pPr>
+      <w:r>
+        <w:t>System Design and Methodology</w:t>
+      </w:r>
+    </w:p>
+    <w:p>
+      <w:pPr>
+        <w:pStyle w:val="p1a"/>
+      </w:pPr>
+      <w:r>
+        <w:t xml:space="preserve">Argus implements a decoupled, layered pipeline: log ingestion and </w:t>
       </w:r>
       <w:proofErr w:type="spellStart"/>
       <w:r>
@@ -284,18 +444,15 @@
       </w:r>
       <w:proofErr w:type="spellEnd"/>
       <w:r>
-        <w:t xml:space="preserve"> layer that unifies four structurally distinct cloud log sources — AWS CloudTrail, Azure AD, Cloudflare Access and GitHub — into one eight-field schema; (2) a label-free detection pipeline whose final detector is a deep autoencoder, complemented by interpretable rarity signals; (3) per-alert explainability combining SHAP attribution with a large-language-model (LLM) analyst assistant; and (4) an evaluation that goes beyond the CERT benchmark to real cloud-breach data and a live streaming replay</w:t>
-      </w:r>
-      <w:r>
-        <w:t>.</w:t>
-      </w:r>
-    </w:p>
-    <w:p>
-      <w:pPr>
-        <w:pStyle w:val="heading1"/>
-      </w:pPr>
-      <w:r>
-        <w:t>Related Work</w:t>
+        <w:t xml:space="preserve">, feature engineering and baseline construction, label-free detection, rarity </w:t>
+      </w:r>
+      <w:proofErr w:type="spellStart"/>
+      <w:r>
+        <w:t>signalling</w:t>
+      </w:r>
+      <w:proofErr w:type="spellEnd"/>
+      <w:r>
+        <w:t>, explainability, and an analyst dashboard. Each layer communicates through a well-defined interface so that the detection and presentation layers remain entirely source-agnostic. The overall architecture and tool stack are shown in Fig. 1.</w:t>
       </w:r>
     </w:p>
     <w:p>
@@ -303,160 +460,7 @@
         <w:pStyle w:val="p1a"/>
       </w:pPr>
       <w:r>
-        <w:t xml:space="preserve">UEBA evolved from earlier User </w:t>
-      </w:r>
-      <w:proofErr w:type="spellStart"/>
-      <w:r>
-        <w:t>Behaviour</w:t>
-      </w:r>
-      <w:proofErr w:type="spellEnd"/>
-      <w:r>
-        <w:t xml:space="preserve"> Analytics systems, broadened to include non-human entities. Gartner </w:t>
-      </w:r>
-      <w:proofErr w:type="spellStart"/>
-      <w:r>
-        <w:t>formalised</w:t>
-      </w:r>
-      <w:proofErr w:type="spellEnd"/>
-      <w:r>
-        <w:t xml:space="preserve"> the category in 2015, </w:t>
-      </w:r>
-      <w:proofErr w:type="spellStart"/>
-      <w:r>
-        <w:t>recognising</w:t>
-      </w:r>
-      <w:proofErr w:type="spellEnd"/>
-      <w:r>
-        <w:t xml:space="preserve"> that monitoring only human activity left significant blind spots in </w:t>
-      </w:r>
-      <w:proofErr w:type="spellStart"/>
-      <w:r>
-        <w:t>organisational</w:t>
-      </w:r>
-      <w:proofErr w:type="spellEnd"/>
-      <w:r>
-        <w:t xml:space="preserve"> security posture [3].</w:t>
-      </w:r>
-    </w:p>
-    <w:p>
-      <w:pPr>
-        <w:pStyle w:val="heading2"/>
-      </w:pPr>
-      <w:r>
-        <w:t>Unsupervised Anomaly Detection</w:t>
-      </w:r>
-    </w:p>
-    <w:p>
-      <w:pPr>
-        <w:pStyle w:val="p1a"/>
-      </w:pPr>
-      <w:r>
-        <w:t xml:space="preserve">Datta et al. demonstrated real-time insider-threat detection with unsupervised learning on the CERT dataset, showing competitive detection without labelled attacks [4]. Liu et al. introduced Isolation Forest, which partitions the feature space at random and isolates anomalies in fewer splits, making it well suited to high-dimensional </w:t>
-      </w:r>
-      <w:proofErr w:type="spellStart"/>
-      <w:r>
-        <w:t>behavioural</w:t>
-      </w:r>
-      <w:proofErr w:type="spellEnd"/>
-      <w:r>
-        <w:t xml:space="preserve"> data [5]. Autoencoder approaches instead learn to reconstruct normal </w:t>
-      </w:r>
-      <w:proofErr w:type="spellStart"/>
-      <w:r>
-        <w:t>behaviour</w:t>
-      </w:r>
-      <w:proofErr w:type="spellEnd"/>
-      <w:r>
-        <w:t>; inputs unseen during training yield elevated reconstruction error that serves directly as an anomaly score [6].</w:t>
-      </w:r>
-    </w:p>
-    <w:p>
-      <w:pPr>
-        <w:pStyle w:val="heading2"/>
-      </w:pPr>
-      <w:r>
-        <w:t>Explainable AI in Security</w:t>
-      </w:r>
-    </w:p>
-    <w:p>
-      <w:pPr>
-        <w:pStyle w:val="p1a"/>
-      </w:pPr>
-      <w:r>
-        <w:t xml:space="preserve">Lundberg and Lee proposed SHAP, a unified framework that explains model predictions using Shapley values from cooperative game theory [7]. Applied to intrusion </w:t>
-      </w:r>
-      <w:r>
-        <w:lastRenderedPageBreak/>
-        <w:t>detection, SHAP attributions have been shown to improve analyst trust by exposing each feature's contribution in an interpretable form [8]. The EU AI Act (2024) mandates explainability for high-risk AI systems in security-critical domains, further motivating the integration of explainable AI [9].</w:t>
-      </w:r>
-    </w:p>
-    <w:p>
-      <w:pPr>
-        <w:pStyle w:val="heading2"/>
-      </w:pPr>
-      <w:r>
-        <w:t>Limitations of Existing Tools</w:t>
-      </w:r>
-    </w:p>
-    <w:p>
-      <w:pPr>
-        <w:pStyle w:val="p1a"/>
-      </w:pPr>
-      <w:proofErr w:type="spellStart"/>
-      <w:r>
-        <w:t>Wazuh</w:t>
-      </w:r>
-      <w:proofErr w:type="spellEnd"/>
-      <w:r>
-        <w:t xml:space="preserve"> encodes its detection logic as static XML rules with no adaptive learning [10]. </w:t>
-      </w:r>
-      <w:proofErr w:type="spellStart"/>
-      <w:r>
-        <w:t>OpenUBA</w:t>
-      </w:r>
-      <w:proofErr w:type="spellEnd"/>
-      <w:r>
-        <w:t xml:space="preserve"> offers basic statistical profiling but no per-user behavioural baselines, while HELK exposes Elasticsearch machine-learning primitives without a custom training pipeline or explanation layer. None of the evaluated tools </w:t>
-      </w:r>
-      <w:proofErr w:type="spellStart"/>
-      <w:r>
-        <w:t>normalise</w:t>
-      </w:r>
-      <w:proofErr w:type="spellEnd"/>
-      <w:r>
-        <w:t xml:space="preserve"> multiple cloud sources or provide per-alert explanations, which is precisely the gap this work addresses.</w:t>
-      </w:r>
-    </w:p>
-    <w:p>
-      <w:pPr>
-        <w:pStyle w:val="heading1"/>
-      </w:pPr>
-      <w:r>
-        <w:t>System Design and Methodology</w:t>
-      </w:r>
-    </w:p>
-    <w:p>
-      <w:pPr>
-        <w:pStyle w:val="p1a"/>
-      </w:pPr>
-      <w:r>
-        <w:t xml:space="preserve">Argus implements a decoupled, layered pipeline: log ingestion and </w:t>
-      </w:r>
-      <w:proofErr w:type="spellStart"/>
-      <w:r>
-        <w:t>normalisation</w:t>
-      </w:r>
-      <w:proofErr w:type="spellEnd"/>
-      <w:r>
-        <w:t xml:space="preserve">, feature engineering and baseline construction, label-free detection, rarity </w:t>
-      </w:r>
-      <w:proofErr w:type="spellStart"/>
-      <w:r>
-        <w:t>signalling</w:t>
-      </w:r>
-      <w:proofErr w:type="spellEnd"/>
-      <w:r>
-        <w:t>, explainability, and an analyst dashboard. Each layer communicates through a well-defined interface so that the detection and presentation layers remain entirely source-agnostic. The overall architecture and tool stack are shown in Fig. 1.</w:t>
+        <w:t xml:space="preserve">The design is driven by eight functional requirements — normalisation to a unified schema, per-user feature aggregation, peer-group assignment, autoencoder risk scoring, SHAP explanation generation, a REST API, an analyst dashboard, and real-time ingestion — and six non-functional requirements covering accuracy (AUROC ≥ 0.90), explainability (≥ 3 SHAP features per high-risk alert), extensibility (a new source requires only one parser), portability (single docker-compose deployment), performance, and input-validation security. Requirements were gathered through review of provider log-schema documentation, consultation with an industry collaborator (ECLOGIC Sdn Bhd), and analysis of the CERT attack scenarios.</w:t>
       </w:r>
     </w:p>
     <w:p>
@@ -469,9 +473,9 @@
         </w:rPr>
         <w:lastRenderedPageBreak/>
         <w:drawing>
-          <wp:inline distT="0" distB="0" distL="0" distR="0" wp14:anchorId="3ADBEACB" wp14:editId="21CB3155">
-            <wp:extent cx="4392930" cy="3277705"/>
-            <wp:effectExtent l="0" t="0" r="0" b="0"/>
+          <wp:inline distT="0" distB="0" distL="0" distR="0" wp14:anchorId="3ADBEACB" wp14:editId="326A8FBA">
+            <wp:extent cx="4392300" cy="3129239"/>
+            <wp:effectExtent l="0" t="0" r="8255" b="0"/>
             <wp:docPr id="101" name="Figure 101"/>
             <wp:cNvGraphicFramePr>
               <a:graphicFrameLocks xmlns:a="http://schemas.openxmlformats.org/drawingml/2006/main" noChangeAspect="1"/>
@@ -483,20 +487,29 @@
                     <pic:cNvPr id="0" name="Figure"/>
                     <pic:cNvPicPr/>
                   </pic:nvPicPr>
-                  <pic:blipFill>
+                  <pic:blipFill rotWithShape="1">
                     <a:blip r:embed="rId8"/>
+                    <a:srcRect t="4516"/>
                     <a:stretch>
                       <a:fillRect/>
                     </a:stretch>
                   </pic:blipFill>
-                  <pic:spPr>
+                  <pic:spPr bwMode="auto">
                     <a:xfrm>
                       <a:off x="0" y="0"/>
-                      <a:ext cx="4392930" cy="3277705"/>
+                      <a:ext cx="4392930" cy="3129688"/>
                     </a:xfrm>
                     <a:prstGeom prst="rect">
                       <a:avLst/>
                     </a:prstGeom>
+                    <a:ln>
+                      <a:noFill/>
+                    </a:ln>
+                    <a:extLst>
+                      <a:ext uri="{53640926-AAD7-44D8-BBD7-CCE9431645EC}">
+                        <a14:shadowObscured xmlns:a14="http://schemas.microsoft.com/office/drawing/2010/main"/>
+                      </a:ext>
+                    </a:extLst>
                   </pic:spPr>
                 </pic:pic>
               </a:graphicData>
@@ -512,13 +525,235 @@
       <w:r>
         <w:t xml:space="preserve">Fig. 1. Argus system architecture and tool stack: four cloud sources are </w:t>
       </w:r>
+      <w:r>
+        <w:t>normalized</w:t>
+      </w:r>
+      <w:r>
+        <w:t xml:space="preserve"> into one schema, scored by a label-free autoencoder with rarity and rule baselines, explained via SHAP and an LLM assistant, then surfaced on a web dashboard.</w:t>
+      </w:r>
+    </w:p>
+    <w:p>
+      <w:pPr>
+        <w:pStyle w:val="heading2"/>
+      </w:pPr>
+      <w:r>
+        <w:t xml:space="preserve">Multi-Cloud Log </w:t>
+      </w:r>
+      <w:r>
+        <w:t>Normalization</w:t>
+      </w:r>
+    </w:p>
+    <w:p>
+      <w:pPr>
+        <w:pStyle w:val="p1a"/>
+      </w:pPr>
+      <w:r>
+        <w:t>Cloud providers emit structurally distinct logs. AWS CloudTrail records API calls in JSON (</w:t>
+      </w:r>
+      <w:proofErr w:type="spellStart"/>
+      <w:r>
+        <w:t>eventTime</w:t>
+      </w:r>
+      <w:proofErr w:type="spellEnd"/>
+      <w:r>
+        <w:t xml:space="preserve">, </w:t>
+      </w:r>
+      <w:proofErr w:type="spellStart"/>
+      <w:r>
+        <w:t>userIdentity.userName</w:t>
+      </w:r>
+      <w:proofErr w:type="spellEnd"/>
+      <w:r>
+        <w:t xml:space="preserve">, </w:t>
+      </w:r>
+      <w:proofErr w:type="spellStart"/>
+      <w:r>
+        <w:t>eventName</w:t>
+      </w:r>
+      <w:proofErr w:type="spellEnd"/>
+      <w:r>
+        <w:t xml:space="preserve">, </w:t>
+      </w:r>
+      <w:proofErr w:type="spellStart"/>
+      <w:r>
+        <w:t>sourceIPAddress</w:t>
+      </w:r>
+      <w:proofErr w:type="spellEnd"/>
+      <w:r>
+        <w:t xml:space="preserve">); Azure AD sign-in logs use </w:t>
+      </w:r>
+      <w:proofErr w:type="spellStart"/>
+      <w:r>
+        <w:t>createdDateTime</w:t>
+      </w:r>
+      <w:proofErr w:type="spellEnd"/>
+      <w:r>
+        <w:t xml:space="preserve">, </w:t>
+      </w:r>
+      <w:proofErr w:type="spellStart"/>
+      <w:r>
+        <w:t>userPrincipalName</w:t>
+      </w:r>
+      <w:proofErr w:type="spellEnd"/>
+      <w:r>
+        <w:t xml:space="preserve"> and </w:t>
+      </w:r>
+      <w:proofErr w:type="spellStart"/>
+      <w:r>
+        <w:t>ipAddress</w:t>
+      </w:r>
+      <w:proofErr w:type="spellEnd"/>
+      <w:r>
+        <w:t xml:space="preserve">; Cloudflare Access uses </w:t>
+      </w:r>
+      <w:proofErr w:type="spellStart"/>
+      <w:r>
+        <w:t>created_at</w:t>
+      </w:r>
+      <w:proofErr w:type="spellEnd"/>
+      <w:r>
+        <w:t xml:space="preserve">, </w:t>
+      </w:r>
+      <w:proofErr w:type="spellStart"/>
+      <w:r>
+        <w:t>user_email</w:t>
+      </w:r>
+      <w:proofErr w:type="spellEnd"/>
+      <w:r>
+        <w:t xml:space="preserve">, </w:t>
+      </w:r>
+      <w:proofErr w:type="spellStart"/>
+      <w:r>
+        <w:t>app_domain</w:t>
+      </w:r>
+      <w:proofErr w:type="spellEnd"/>
+      <w:r>
+        <w:t xml:space="preserve"> and a country field; GitHub audit events use their own actor and action keys. A </w:t>
+      </w:r>
+      <w:proofErr w:type="spellStart"/>
+      <w:r>
+        <w:t>normalisation</w:t>
+      </w:r>
+      <w:proofErr w:type="spellEnd"/>
+      <w:r>
+        <w:t xml:space="preserve"> layer maps all four onto a single eight-field internal </w:t>
+      </w:r>
+      <w:proofErr w:type="gramStart"/>
+      <w:r>
+        <w:t>schema: {</w:t>
+      </w:r>
+      <w:proofErr w:type="gramEnd"/>
+      <w:r>
+        <w:t xml:space="preserve">timestamp, user, source, action, resource, ip_address, metadata, </w:t>
+      </w:r>
+      <w:proofErr w:type="gramStart"/>
+      <w:r>
+        <w:t>raw},</w:t>
+      </w:r>
+      <w:proofErr w:type="gramEnd"/>
+      <w:r>
+        <w:t xml:space="preserve"> where metadata preserves source-specific fields (e.g. geo-location, Azure conditional-access status) and raw retains the unmodified original event.</w:t>
+      </w:r>
+    </w:p>
+    <w:p>
+      <w:r>
+        <w:t>This design keeps the downstream pipeline source-agnostic: adding a new provider requires only a single parser function, with no change to feature extraction, detection or the dashboard. For the benchmark evaluation, the CERT r4.2 dataset is converted into the same schema, providing labelled ground truth across logon, file, email, device and HTTP activity [11].</w:t>
+      </w:r>
+    </w:p>
+    <w:p>
+      <w:pPr>
+        <w:pStyle w:val="heading2"/>
+      </w:pPr>
+      <w:r>
+        <w:t xml:space="preserve">Feature Engineering and </w:t>
+      </w:r>
+      <w:proofErr w:type="spellStart"/>
+      <w:r>
+        <w:t>Behavioural</w:t>
+      </w:r>
+      <w:proofErr w:type="spellEnd"/>
+      <w:r>
+        <w:t xml:space="preserve"> Baselines</w:t>
+      </w:r>
+    </w:p>
+    <w:p>
+      <w:pPr>
+        <w:pStyle w:val="p1a"/>
+      </w:pPr>
+      <w:proofErr w:type="spellStart"/>
+      <w:proofErr w:type="gramStart"/>
+      <w:r>
+        <w:t>Normalised</w:t>
+      </w:r>
+      <w:proofErr w:type="spellEnd"/>
+      <w:proofErr w:type="gramEnd"/>
+      <w:r>
+        <w:t xml:space="preserve"> events are aggregated into daily </w:t>
+      </w:r>
+      <w:proofErr w:type="spellStart"/>
+      <w:r>
+        <w:t>behavioural</w:t>
+      </w:r>
+      <w:proofErr w:type="spellEnd"/>
+      <w:r>
+        <w:t xml:space="preserve"> vectors per user. For CERT data, daily activity is aggregated into a 71-dimensional per-user vector — the mean, </w:t>
+      </w:r>
+      <w:r>
+        <w:lastRenderedPageBreak/>
+        <w:t>maximum and sum of 21 base behavioural features capturing volume, timing, device, file and communication patterns, augmented with burst ratios (peak-to-average activity spikes) and peer-group ratios; for live cloud data, a compact 12-dimensional per-user-day feature vector is used. K-Means clustering, fitted on normal users only, assigns each user to a behavioural peer group, and per-feature peer ratios quantify how far a user's behaviour departs from the norm of behaviourally similar users.</w:t>
+      </w:r>
+    </w:p>
+    <w:p>
+      <w:pPr>
+        <w:pStyle w:val="heading2"/>
+      </w:pPr>
+      <w:r>
+        <w:t>Label-Free Detection</w:t>
+      </w:r>
+    </w:p>
+    <w:p>
+      <w:pPr>
+        <w:pStyle w:val="p1a"/>
+      </w:pPr>
+      <w:r>
+        <w:t xml:space="preserve">Two unsupervised models are trained exclusively on normal user-days, with labelled malicious users excluded from training. An Isolation Forest (scikit-learn) isolates structurally distinct points in fewer partitioning steps, producing a </w:t>
+      </w:r>
       <w:proofErr w:type="spellStart"/>
       <w:r>
         <w:t>normalised</w:t>
       </w:r>
       <w:proofErr w:type="spellEnd"/>
       <w:r>
-        <w:t xml:space="preserve"> into one schema, scored by a label-free autoencoder with rarity and rule baselines, explained via SHAP and an LLM assistant, then surfaced on a web dashboard.</w:t>
+        <w:t xml:space="preserve"> anomaly score in [0, 1]. A deep autoencoder (</w:t>
+      </w:r>
+      <w:proofErr w:type="spellStart"/>
+      <w:r>
+        <w:t>PyTorch</w:t>
+      </w:r>
+      <w:proofErr w:type="spellEnd"/>
+      <w:r>
+        <w:t xml:space="preserve">) learns to reconstruct normal </w:t>
+      </w:r>
+      <w:proofErr w:type="spellStart"/>
+      <w:r>
+        <w:t>behavioural</w:t>
+      </w:r>
+      <w:proofErr w:type="spellEnd"/>
+      <w:r>
+        <w:t xml:space="preserve"> vectors; the mean-squared reconstruction error, </w:t>
+      </w:r>
+      <w:proofErr w:type="spellStart"/>
+      <w:r>
+        <w:t>normalised</w:t>
+      </w:r>
+      <w:proofErr w:type="spellEnd"/>
+      <w:r>
+        <w:t xml:space="preserve"> to [0, 1], is the anomaly score for an input.</w:t>
+      </w:r>
+    </w:p>
+    <w:p>
+      <w:r>
+        <w:t>Unlike the earlier ensemble formulation, the autoencoder reconstruction error is used as the final risk score, because it gave the strongest separation in our experiments. The Isolation Forest, a threshold-based rule scorer, and a weighted average of Isolation Forest and autoencoder are retained as transparent baselines for comparison rather than as the production detector.</w:t>
       </w:r>
     </w:p>
     <w:p>
@@ -526,24 +761,19 @@
         <w:pStyle w:val="heading2"/>
       </w:pPr>
       <w:r>
-        <w:t xml:space="preserve">Multi-Cloud Log </w:t>
-      </w:r>
-      <w:proofErr w:type="spellStart"/>
-      <w:r>
-        <w:t>Normalisation</w:t>
-      </w:r>
-      <w:proofErr w:type="spellEnd"/>
+        <w:t>Rarity Signals</w:t>
+      </w:r>
     </w:p>
     <w:p>
       <w:pPr>
         <w:pStyle w:val="p1a"/>
       </w:pPr>
       <w:r>
-        <w:t>Cloud providers emit structurally distinct logs. AWS CloudTrail records API calls in JSON (</w:t>
-      </w:r>
-      <w:proofErr w:type="spellStart"/>
-      <w:r>
-        <w:t>eventTime</w:t>
+        <w:t xml:space="preserve">Complementing the autoencoder, a rarity scorer emits six interpretable binary flags per event: </w:t>
+      </w:r>
+      <w:proofErr w:type="spellStart"/>
+      <w:r>
+        <w:t>first_time_action</w:t>
       </w:r>
       <w:proofErr w:type="spellEnd"/>
       <w:r>
@@ -551,7 +781,7 @@
       </w:r>
       <w:proofErr w:type="spellStart"/>
       <w:r>
-        <w:t>userIdentity.userName</w:t>
+        <w:t>new_ip</w:t>
       </w:r>
       <w:proofErr w:type="spellEnd"/>
       <w:r>
@@ -559,7 +789,7 @@
       </w:r>
       <w:proofErr w:type="spellStart"/>
       <w:r>
-        <w:t>eventName</w:t>
+        <w:t>off_hours</w:t>
       </w:r>
       <w:proofErr w:type="spellEnd"/>
       <w:r>
@@ -567,15 +797,7 @@
       </w:r>
       <w:proofErr w:type="spellStart"/>
       <w:r>
-        <w:t>sourceIPAddress</w:t>
-      </w:r>
-      <w:proofErr w:type="spellEnd"/>
-      <w:r>
-        <w:t xml:space="preserve">); Azure AD sign-in logs use </w:t>
-      </w:r>
-      <w:proofErr w:type="spellStart"/>
-      <w:r>
-        <w:t>createdDateTime</w:t>
+        <w:t>high_volume</w:t>
       </w:r>
       <w:proofErr w:type="spellEnd"/>
       <w:r>
@@ -583,7 +805,7 @@
       </w:r>
       <w:proofErr w:type="spellStart"/>
       <w:r>
-        <w:t>userPrincipalName</w:t>
+        <w:t>sensitive_resource</w:t>
       </w:r>
       <w:proofErr w:type="spellEnd"/>
       <w:r>
@@ -591,271 +813,59 @@
       </w:r>
       <w:proofErr w:type="spellStart"/>
       <w:r>
-        <w:t>ipAddress</w:t>
-      </w:r>
-      <w:proofErr w:type="spellEnd"/>
-      <w:r>
-        <w:t xml:space="preserve">; Cloudflare Access uses </w:t>
-      </w:r>
-      <w:proofErr w:type="spellStart"/>
-      <w:r>
-        <w:t>created_at</w:t>
-      </w:r>
-      <w:proofErr w:type="spellEnd"/>
-      <w:r>
-        <w:t xml:space="preserve">, </w:t>
-      </w:r>
-      <w:proofErr w:type="spellStart"/>
-      <w:r>
-        <w:t>user_email</w:t>
-      </w:r>
-      <w:proofErr w:type="spellEnd"/>
-      <w:r>
-        <w:t xml:space="preserve">, </w:t>
-      </w:r>
-      <w:proofErr w:type="spellStart"/>
-      <w:r>
-        <w:t>app_domain</w:t>
-      </w:r>
-      <w:proofErr w:type="spellEnd"/>
-      <w:r>
-        <w:t xml:space="preserve"> and a country field; GitHub audit events use their own actor and action keys. A </w:t>
-      </w:r>
-      <w:proofErr w:type="spellStart"/>
-      <w:r>
-        <w:t>normalisation</w:t>
-      </w:r>
-      <w:proofErr w:type="spellEnd"/>
-      <w:r>
-        <w:t xml:space="preserve"> layer maps all four onto a single eight-field internal </w:t>
-      </w:r>
-      <w:proofErr w:type="gramStart"/>
-      <w:r>
-        <w:t>schema: {</w:t>
-      </w:r>
-      <w:proofErr w:type="gramEnd"/>
-      <w:r>
-        <w:t xml:space="preserve">timestamp, user, source, action, resource, ip_address, metadata, raw}, where metadata preserves source-specific fields (e.g. geo-location, Azure conditional-access status) and raw retains the unmodified original event.</w:t>
-      </w:r>
-      <w:proofErr w:type="gramEnd"/>
-    </w:p>
-    <w:p>
-      <w:r>
-        <w:t xml:space="preserve">This design keeps the downstream pipeline source-agnostic: adding a new provider requires only a single parser function, with no change to feature extraction, detection or the dashboard. For the benchmark evaluation, the CERT r4.2 dataset is converted </w:t>
-      </w:r>
+        <w:t>geo_rarity</w:t>
+      </w:r>
+      <w:proofErr w:type="spellEnd"/>
+      <w:r>
+        <w:t xml:space="preserve">. The </w:t>
+      </w:r>
+      <w:proofErr w:type="spellStart"/>
+      <w:r>
+        <w:t>geo_rarity</w:t>
+      </w:r>
+      <w:proofErr w:type="spellEnd"/>
+      <w:r>
+        <w:t xml:space="preserve"> flag fires when an event originates from a country never previously observed for that user, derived from the Cloudflare Access country field — the only source with reliable geolocation. The rarity score is the fraction of the six flags that fire, giving analysts a fast, human-readable corroboration of the model score.</w:t>
+      </w:r>
+    </w:p>
+    <w:p>
+      <w:pPr>
+        <w:pStyle w:val="heading2"/>
+      </w:pPr>
+      <w:r>
+        <w:t>Explainability</w:t>
+      </w:r>
+    </w:p>
+    <w:p>
+      <w:pPr>
+        <w:pStyle w:val="p1a"/>
+      </w:pPr>
+      <w:r>
+        <w:t xml:space="preserve">Every flagged event is passed to a SHAP </w:t>
+      </w:r>
+      <w:proofErr w:type="spellStart"/>
+      <w:r>
+        <w:t>KernelExplainer</w:t>
+      </w:r>
+      <w:proofErr w:type="spellEnd"/>
+      <w:r>
+        <w:t xml:space="preserve">, which attributes the risk score to individual features and produces a ranked, human-readable reason string — for example, that after-hours activity and a first-seen IP address together account for the majority of an alert's score. A large-language-model assistant (configurable across Gemini, DeepSeek and </w:t>
+      </w:r>
+      <w:proofErr w:type="spellStart"/>
+      <w:r>
+        <w:t>Groq</w:t>
+      </w:r>
+      <w:proofErr w:type="spellEnd"/>
+      <w:r>
+        <w:t>) then converts this attribution into a concise natural-language narrative for the analyst, turning opaque scores into investigable intelligence and directly addressing the explainability mandate of the EU AI Act [9].</w:t>
+      </w:r>
+    </w:p>
+    <w:p>
+      <w:pPr>
+        <w:pStyle w:val="heading1"/>
+      </w:pPr>
       <w:r>
         <w:lastRenderedPageBreak/>
-        <w:t>into the same schema, providing labelled ground truth across logon, file, email, device and HTTP activity [11].</w:t>
-      </w:r>
-    </w:p>
-    <w:p>
-      <w:pPr>
-        <w:pStyle w:val="heading2"/>
-      </w:pPr>
-      <w:r>
-        <w:t xml:space="preserve">Feature Engineering and </w:t>
-      </w:r>
-      <w:proofErr w:type="spellStart"/>
-      <w:r>
-        <w:t>Behavioural</w:t>
-      </w:r>
-      <w:proofErr w:type="spellEnd"/>
-      <w:r>
-        <w:t xml:space="preserve"> Baselines</w:t>
-      </w:r>
-    </w:p>
-    <w:p>
-      <w:pPr>
-        <w:pStyle w:val="p1a"/>
-      </w:pPr>
-      <w:proofErr w:type="spellStart"/>
-      <w:proofErr w:type="gramStart"/>
-      <w:r>
-        <w:t>Normalised</w:t>
-      </w:r>
-      <w:proofErr w:type="spellEnd"/>
-      <w:proofErr w:type="gramEnd"/>
-      <w:r>
-        <w:t xml:space="preserve"> events are aggregated into daily </w:t>
-      </w:r>
-      <w:proofErr w:type="spellStart"/>
-      <w:r>
-        <w:t>behavioural</w:t>
-      </w:r>
-      <w:proofErr w:type="spellEnd"/>
-      <w:r>
-        <w:t xml:space="preserve"> vectors per user. For CERT data, daily activity is aggregated into a 71-dimensional per-user vector — the mean, maximum and sum of 21 base behavioural features capturing volume, timing, device, file and communication patterns, augmented with burst ratios (peak-to-average activity spikes) and peer-group ratios; for live cloud data, a compact 12-dimensional per-user-day feature vector is used. K-Means clustering, fitted on normal users only, assigns each user to a behavioural peer group, and per-feature peer ratios quantify how far a user's behaviour departs from the norm of behaviourally similar users.</w:t>
-      </w:r>
-    </w:p>
-    <w:p>
-      <w:pPr>
-        <w:pStyle w:val="heading2"/>
-      </w:pPr>
-      <w:r>
-        <w:t>Label-Free Detection</w:t>
-      </w:r>
-    </w:p>
-    <w:p>
-      <w:pPr>
-        <w:pStyle w:val="p1a"/>
-      </w:pPr>
-      <w:r>
-        <w:t xml:space="preserve">Two unsupervised models are trained exclusively on normal user-days, with labelled malicious users excluded from training. An Isolation Forest (scikit-learn) isolates structurally distinct points in fewer partitioning steps, producing a </w:t>
-      </w:r>
-      <w:proofErr w:type="spellStart"/>
-      <w:r>
-        <w:t>normalised</w:t>
-      </w:r>
-      <w:proofErr w:type="spellEnd"/>
-      <w:r>
-        <w:t xml:space="preserve"> anomaly score in [0, 1]. A deep autoencoder (</w:t>
-      </w:r>
-      <w:proofErr w:type="spellStart"/>
-      <w:r>
-        <w:t>PyTorch</w:t>
-      </w:r>
-      <w:proofErr w:type="spellEnd"/>
-      <w:r>
-        <w:t xml:space="preserve">) learns to reconstruct normal </w:t>
-      </w:r>
-      <w:proofErr w:type="spellStart"/>
-      <w:r>
-        <w:t>behavioural</w:t>
-      </w:r>
-      <w:proofErr w:type="spellEnd"/>
-      <w:r>
-        <w:t xml:space="preserve"> vectors; the mean-squared reconstruction error, </w:t>
-      </w:r>
-      <w:proofErr w:type="spellStart"/>
-      <w:r>
-        <w:t>normalised</w:t>
-      </w:r>
-      <w:proofErr w:type="spellEnd"/>
-      <w:r>
-        <w:t xml:space="preserve"> to [0, 1], is the anomaly score for an input.</w:t>
-      </w:r>
-    </w:p>
-    <w:p>
-      <w:r>
-        <w:t>Unlike the earlier ensemble formulation, the autoencoder reconstruction error is used as the final risk score, because it gave the strongest separation in our experiments. The Isolation Forest, a threshold-based rule scorer, and a weighted average of Isolation Forest and autoencoder are retained as transparent baselines for comparison rather than as the production detector.</w:t>
-      </w:r>
-    </w:p>
-    <w:p>
-      <w:pPr>
-        <w:pStyle w:val="heading2"/>
-      </w:pPr>
-      <w:r>
-        <w:t>Rarity Signals</w:t>
-      </w:r>
-    </w:p>
-    <w:p>
-      <w:pPr>
-        <w:pStyle w:val="p1a"/>
-      </w:pPr>
-      <w:r>
-        <w:t xml:space="preserve">Complementing the autoencoder, a rarity scorer emits six interpretable binary flags per event: </w:t>
-      </w:r>
-      <w:proofErr w:type="spellStart"/>
-      <w:r>
-        <w:t>first_time_action</w:t>
-      </w:r>
-      <w:proofErr w:type="spellEnd"/>
-      <w:r>
-        <w:t xml:space="preserve">, </w:t>
-      </w:r>
-      <w:proofErr w:type="spellStart"/>
-      <w:r>
-        <w:t>new_ip</w:t>
-      </w:r>
-      <w:proofErr w:type="spellEnd"/>
-      <w:r>
-        <w:t xml:space="preserve">, </w:t>
-      </w:r>
-      <w:proofErr w:type="spellStart"/>
-      <w:r>
-        <w:t>off_hours</w:t>
-      </w:r>
-      <w:proofErr w:type="spellEnd"/>
-      <w:r>
-        <w:t xml:space="preserve">, </w:t>
-      </w:r>
-      <w:proofErr w:type="spellStart"/>
-      <w:r>
-        <w:t>high_volume</w:t>
-      </w:r>
-      <w:proofErr w:type="spellEnd"/>
-      <w:r>
-        <w:t xml:space="preserve">, </w:t>
-      </w:r>
-      <w:proofErr w:type="spellStart"/>
-      <w:r>
-        <w:t>sensitive_resource</w:t>
-      </w:r>
-      <w:proofErr w:type="spellEnd"/>
-      <w:r>
-        <w:t xml:space="preserve"> and </w:t>
-      </w:r>
-      <w:proofErr w:type="spellStart"/>
-      <w:r>
-        <w:t>geo_rarity</w:t>
-      </w:r>
-      <w:proofErr w:type="spellEnd"/>
-      <w:r>
-        <w:t xml:space="preserve">. The </w:t>
-      </w:r>
-      <w:proofErr w:type="spellStart"/>
-      <w:r>
-        <w:t>geo_rarity</w:t>
-      </w:r>
-      <w:proofErr w:type="spellEnd"/>
-      <w:r>
-        <w:t xml:space="preserve"> flag fires when an event originates from a country never previously observed for that user, derived from the Cloudflare Access country field — the only source with reliable geolocation. The rarity score is the fraction of the six flags that fire, giving analysts a fast, human-readable corroboration of the model score.</w:t>
-      </w:r>
-    </w:p>
-    <w:p>
-      <w:pPr>
-        <w:pStyle w:val="heading2"/>
-      </w:pPr>
-      <w:r>
-        <w:t>Explainability</w:t>
-      </w:r>
-    </w:p>
-    <w:p>
-      <w:pPr>
-        <w:pStyle w:val="p1a"/>
-      </w:pPr>
-      <w:r>
-        <w:t xml:space="preserve">Every flagged event is passed to a SHAP </w:t>
-      </w:r>
-      <w:proofErr w:type="spellStart"/>
-      <w:r>
-        <w:t>KernelExplainer</w:t>
-      </w:r>
-      <w:proofErr w:type="spellEnd"/>
-      <w:r>
-        <w:t xml:space="preserve">, which attributes the risk score to individual features and produces a ranked, human-readable reason string — for example, that after-hours activity and a first-seen IP address together account for the majority of an alert's score. A large-language-model assistant (configurable across Gemini, DeepSeek and </w:t>
-      </w:r>
-      <w:proofErr w:type="spellStart"/>
-      <w:r>
-        <w:t>Groq</w:t>
-      </w:r>
-      <w:proofErr w:type="spellEnd"/>
-      <w:r>
-        <w:t>) then converts this attribution into a concise natural-</w:t>
-      </w:r>
-      <w:r>
-        <w:lastRenderedPageBreak/>
-        <w:t>language narrative for the analyst, turning opaque scores into investigable intelligence and directly addressing the explainabili</w:t>
-      </w:r>
-      <w:r>
-        <w:t>ty mandate of the EU AI Act [9].</w:t>
-      </w:r>
-    </w:p>
-    <w:p>
-      <w:pPr>
-        <w:pStyle w:val="heading1"/>
-      </w:pPr>
-      <w:r>
         <w:t>Evaluation</w:t>
       </w:r>
     </w:p>
@@ -1674,6 +1684,7 @@
               <w:rPr>
                 <w:sz w:val="18"/>
               </w:rPr>
+              <w:lastRenderedPageBreak/>
               <w:t xml:space="preserve">Multi-cloud </w:t>
             </w:r>
             <w:proofErr w:type="spellStart"/>
@@ -1978,7 +1989,6 @@
               <w:rPr>
                 <w:sz w:val="18"/>
               </w:rPr>
-              <w:lastRenderedPageBreak/>
               <w:t>SHAP + LLM explainability</w:t>
             </w:r>
           </w:p>
@@ -2263,10 +2273,58 @@
       </w:r>
       <w:proofErr w:type="spellEnd"/>
       <w:r>
-        <w:t xml:space="preserve"> layer makes adding a new cloud provider a one-parser change</w:t>
-      </w:r>
-      <w:r>
-        <w:t>.</w:t>
+        <w:t xml:space="preserve"> layer makes adding a new cloud provider a one-parser change. Fig. 4 shows the analyst-facing result: a risk-ranked dashboard with severity tiers and per-source badges.</w:t>
+      </w:r>
+    </w:p>
+    <w:p>
+      <w:pPr>
+        <w:pStyle w:val="image"/>
+        <w:jc w:val="center"/>
+      </w:pPr>
+      <w:r>
+        <w:drawing>
+          <wp:inline distT="0" distB="0" distL="0" distR="0">
+            <wp:extent cx="3953510" cy="2745493"/>
+            <wp:effectExtent l="0" t="0" r="0" b="0"/>
+            <wp:docPr id="900" name="Figure 900"/>
+            <wp:cNvGraphicFramePr>
+              <a:graphicFrameLocks xmlns:a="http://schemas.openxmlformats.org/drawingml/2006/main" noChangeAspect="1"/>
+            </wp:cNvGraphicFramePr>
+            <a:graphic xmlns:a="http://schemas.openxmlformats.org/drawingml/2006/main">
+              <a:graphicData uri="http://schemas.openxmlformats.org/drawingml/2006/picture">
+                <pic:pic xmlns:pic="http://schemas.openxmlformats.org/drawingml/2006/picture">
+                  <pic:nvPicPr>
+                    <pic:cNvPr id="0" name="Figure"/>
+                    <pic:cNvPicPr/>
+                  </pic:nvPicPr>
+                  <pic:blipFill>
+                    <a:blip r:embed="rIdImg900"/>
+                    <a:stretch>
+                      <a:fillRect/>
+                    </a:stretch>
+                  </pic:blipFill>
+                  <pic:spPr>
+                    <a:xfrm>
+                      <a:off x="0" y="0"/>
+                      <a:ext cx="3953510" cy="2745493"/>
+                    </a:xfrm>
+                    <a:prstGeom prst="rect">
+                      <a:avLst/>
+                    </a:prstGeom>
+                  </pic:spPr>
+                </pic:pic>
+              </a:graphicData>
+            </a:graphic>
+          </wp:inline>
+        </w:drawing>
+      </w:r>
+    </w:p>
+    <w:p>
+      <w:pPr>
+        <w:pStyle w:val="figurecaption"/>
+      </w:pPr>
+      <w:r>
+        <w:t xml:space="preserve">Fig. 4. The analyst dashboard: entities ranked by autoencoder risk score with severity tiers and per-source badges.</w:t>
       </w:r>
     </w:p>
     <w:p>
@@ -2292,7 +2350,11 @@
       <w:proofErr w:type="spellEnd"/>
       <w:proofErr w:type="gramEnd"/>
       <w:r>
-        <w:t xml:space="preserve"> and live-replay results mitigate but do not fully remove this concern. Detection is also uneven across the three CERT insider scenarios: the autoencoder recovers the burst-like Scenario 1 (30/30) and Scenario 3 (10/10) but only the low-and-slow Scenario 2 (12/30), which a supervised stacking ensemble detects (27/30) — the signal is present in the features but missed by the per-day reconstruction objective. Because this is a temporal-representation gap rather than a model-capacity limitation, the planned remedy is a graded comparison of time-aware detection — change-point monitoring (CUSUM, consistent with the statistical-process-control basis of the baseline) and longitudinal trend features, evaluated against sequence models (LSTM / Transformer autoencoders) — to establish how much temporal modelling low-and-slow detection actually requires; an initial Transformer prototype did not yet improve Scenario 2, plausibly constrained by only 70 insider entities, so the contribution is the comparison itself. The primary detection-quality direction, however, is improving multi-cloud coverage through per-source feature engineering — for example incorporating Azure's native risk signals — since the cloud autoencoder was trained on AWS CloudTrail. The system does not yet detect model drift as legitimate </w:t>
+        <w:t xml:space="preserve"> and live-replay results mitigate but do not fully remove this concern. Detection is also uneven across the three CERT insider scenarios: the autoencoder recovers the burst-like Scenario 1 (30/30) and Scenario 3 (10/10) but only the low-and-slow Scenario 2 (12/30), which a supervised stacking ensemble </w:t>
+      </w:r>
+      <w:r>
+        <w:lastRenderedPageBreak/>
+        <w:t xml:space="preserve">detects (27/30) — the signal is present in the features but missed by the per-day reconstruction objective. Because this is a temporal-representation gap rather than a model-capacity limitation, the planned remedy is a graded comparison of time-aware detection — change-point monitoring (CUSUM, consistent with the statistical-process-control basis of the baseline) and longitudinal trend features, evaluated against sequence models (LSTM / Transformer autoencoders) — to establish how much temporal modelling low-and-slow detection actually requires; an initial Transformer prototype did not yet improve Scenario 2, plausibly constrained by only 70 insider entities, so the contribution is the comparison itself. The primary detection-quality direction, however, is improving multi-cloud coverage through per-source feature engineering — for example incorporating Azure's native risk signals — since the cloud autoencoder was trained on AWS CloudTrail. The system does not yet detect model drift as legitimate </w:t>
       </w:r>
       <w:proofErr w:type="spellStart"/>
       <w:r>
@@ -2308,113 +2370,110 @@
         <w:pStyle w:val="heading1"/>
       </w:pPr>
       <w:r>
+        <w:t>Conclusion</w:t>
+      </w:r>
+    </w:p>
+    <w:p>
+      <w:pPr>
+        <w:pStyle w:val="p1a"/>
+      </w:pPr>
+      <w:r>
+        <w:t xml:space="preserve">This paper presented Argus, a cloud-native UEBA platform that detects insider threats without labelled attack data. A four-source </w:t>
+      </w:r>
+      <w:proofErr w:type="spellStart"/>
+      <w:r>
+        <w:t>normalisation</w:t>
+      </w:r>
+      <w:proofErr w:type="spellEnd"/>
+      <w:r>
+        <w:t xml:space="preserve"> layer unifies AWS, Azure, Cloudflare and GitHub logs into one schema; a label-free autoencoder serves as the final detector, supported by interpretable rarity and rule baselines; and SHAP attribution with an LLM assistant explains every alert. On CERT r4.2 the autoencoder achieves AUROC 0.976, AUPRC 0.851 and F1 0.787, and external validation on </w:t>
+      </w:r>
+      <w:proofErr w:type="spellStart"/>
+      <w:proofErr w:type="gramStart"/>
+      <w:r>
+        <w:t>flaws.cloud</w:t>
+      </w:r>
+      <w:proofErr w:type="spellEnd"/>
+      <w:proofErr w:type="gramEnd"/>
+      <w:r>
+        <w:t xml:space="preserve"> (AUROC 0.724) and a live streaming replay (AUROC 0.917) confirms its real-world viability. The work shows that effective, explainable, cloud-native insider-threat detection is achievable with open-source tools and custom unsupervised learning, without reliance on costly commercial platforms.</w:t>
+      </w:r>
+    </w:p>
+    <w:p>
+      <w:pPr>
+        <w:pStyle w:val="acknowlegments"/>
+      </w:pPr>
+      <w:r>
+        <w:t>Acknowledgments. The author thanks Dr. Firdaus Sahran and the Faculty of Computer Science and Information Technology, Universiti Malaya, for their guidance and support; Mohd Akbar bin Abu Bakar (Lead Engineer, ECLOGIC Sdn Bhd) for industry collaboration validating the system's operational relevance; and Carnegie Mellon University for providing the CERT Insider Threat Dataset.</w:t>
+      </w:r>
+    </w:p>
+    <w:p>
+      <w:pPr>
+        <w:pStyle w:val="acknowlegments"/>
+      </w:pPr>
+      <w:r>
+        <w:t>Disclosure of Interests. The authors declare that they have no competing interests.</w:t>
+      </w:r>
+    </w:p>
+    <w:p>
+      <w:pPr>
+        <w:pStyle w:val="heading1"/>
+      </w:pPr>
+      <w:r>
+        <w:t>References</w:t>
+      </w:r>
+    </w:p>
+    <w:p>
+      <w:pPr>
+        <w:pStyle w:val="referenceitem"/>
+      </w:pPr>
+      <w:r>
+        <w:t>Verizon: 2025 Data Breach Investigations Report. Verizon Enterprise Solutions (2025)</w:t>
+      </w:r>
+    </w:p>
+    <w:p>
+      <w:pPr>
+        <w:pStyle w:val="referenceitem"/>
+      </w:pPr>
+      <w:proofErr w:type="spellStart"/>
+      <w:r>
+        <w:t>Ponemon</w:t>
+      </w:r>
+      <w:proofErr w:type="spellEnd"/>
+      <w:r>
+        <w:t xml:space="preserve"> Institute: 2025 Cost of Insider Risks Global Report. Proofpoint (2025)</w:t>
+      </w:r>
+    </w:p>
+    <w:p>
+      <w:pPr>
+        <w:pStyle w:val="referenceitem"/>
+      </w:pPr>
+      <w:r>
+        <w:t>Gartner: Market Guide for User and Entity Behavior Analytics. Gartner Research (2015)</w:t>
+      </w:r>
+    </w:p>
+    <w:p>
+      <w:pPr>
+        <w:pStyle w:val="referenceitem"/>
+      </w:pPr>
+      <w:r>
+        <w:t xml:space="preserve">Datta, J., Dasgupta, S., Dasgupta, R., Reddy, K.R.: Real-time threat detection in UEBA using unsupervised learning algorithms. In: Proc. IEEE </w:t>
+      </w:r>
+      <w:proofErr w:type="spellStart"/>
+      <w:r>
+        <w:t>IEMENTech</w:t>
+      </w:r>
+      <w:proofErr w:type="spellEnd"/>
+      <w:r>
+        <w:t xml:space="preserve"> (2021)</w:t>
+      </w:r>
+    </w:p>
+    <w:p>
+      <w:pPr>
+        <w:pStyle w:val="referenceitem"/>
+      </w:pPr>
+      <w:r>
         <w:lastRenderedPageBreak/>
-        <w:t>Conclusion</w:t>
-      </w:r>
-    </w:p>
-    <w:p>
-      <w:pPr>
-        <w:pStyle w:val="p1a"/>
-      </w:pPr>
-      <w:r>
-        <w:t xml:space="preserve">This paper presented Argus, a cloud-native UEBA platform that detects insider threats without labelled attack data. A four-source </w:t>
-      </w:r>
-      <w:proofErr w:type="spellStart"/>
-      <w:r>
-        <w:t>normalisation</w:t>
-      </w:r>
-      <w:proofErr w:type="spellEnd"/>
-      <w:r>
-        <w:t xml:space="preserve"> layer unifies AWS, Azure, Cloudflare and GitHub logs into one schema; a label-free autoencoder serves as the final detector, supported by interpretable rarity and rule baselines; and SHAP attribution with an LLM assistant explains every alert. On CERT r4.2 the autoencoder achieves AUROC 0.976, AUPRC 0.851 and F1 0.787, and external validation on </w:t>
-      </w:r>
-      <w:proofErr w:type="spellStart"/>
-      <w:proofErr w:type="gramStart"/>
-      <w:r>
-        <w:t>flaws.cloud</w:t>
-      </w:r>
-      <w:proofErr w:type="spellEnd"/>
-      <w:proofErr w:type="gramEnd"/>
-      <w:r>
-        <w:t xml:space="preserve"> (AUROC 0.724) and a live streaming replay (AUROC 0.917) confirms its real-world viability. The work shows that effective, explainable, clo</w:t>
-      </w:r>
-      <w:r>
-        <w:t>ud-native insider-threat detection is achievable with open-source tools and custom unsupervised learning, without reliance on costly commercial platforms.</w:t>
-      </w:r>
-    </w:p>
-    <w:p>
-      <w:pPr>
-        <w:pStyle w:val="acknowlegments"/>
-      </w:pPr>
-      <w:r>
-        <w:t>Acknowledgments. The author thanks Dr. Firdaus Sahran and the Faculty of Computer Science and Information Technology, Universiti Malaya, for their guidance and support; Mohd Akbar bin Abu Bakar (Lead Engineer, ECLOGIC Sdn Bhd) for industry collaboration validating the system's operational relevance; and Carnegie Mellon University for providing the CERT Insider Threat Dataset.</w:t>
-      </w:r>
-    </w:p>
-    <w:p>
-      <w:pPr>
-        <w:pStyle w:val="acknowlegments"/>
-      </w:pPr>
-      <w:r>
-        <w:t>Disclosure of Interests. The authors declare that they have no competing interests.</w:t>
-      </w:r>
-    </w:p>
-    <w:p>
-      <w:pPr>
-        <w:pStyle w:val="heading1"/>
-      </w:pPr>
-      <w:r>
-        <w:t>References</w:t>
-      </w:r>
-    </w:p>
-    <w:p>
-      <w:pPr>
-        <w:pStyle w:val="referenceitem"/>
-      </w:pPr>
-      <w:r>
-        <w:t>Verizon: 2025 Data Breach Investigations Report. Verizon Enterprise Solutions (2025)</w:t>
-      </w:r>
-    </w:p>
-    <w:p>
-      <w:pPr>
-        <w:pStyle w:val="referenceitem"/>
-      </w:pPr>
-      <w:proofErr w:type="spellStart"/>
-      <w:r>
-        <w:t>Ponemon</w:t>
-      </w:r>
-      <w:proofErr w:type="spellEnd"/>
-      <w:r>
-        <w:t xml:space="preserve"> Institute: 2025 Cost of Insider Risks Global Report. Proofpoint (2025)</w:t>
-      </w:r>
-    </w:p>
-    <w:p>
-      <w:pPr>
-        <w:pStyle w:val="referenceitem"/>
-      </w:pPr>
-      <w:r>
-        <w:t>Gartner: Market Guide for User and Entity Behavior Analytics. Gartner Research (2015)</w:t>
-      </w:r>
-    </w:p>
-    <w:p>
-      <w:pPr>
-        <w:pStyle w:val="referenceitem"/>
-      </w:pPr>
-      <w:r>
-        <w:t xml:space="preserve">Datta, J., Dasgupta, S., Dasgupta, R., Reddy, K.R.: Real-time threat detection in UEBA using unsupervised learning algorithms. In: Proc. IEEE </w:t>
-      </w:r>
-      <w:proofErr w:type="spellStart"/>
-      <w:r>
-        <w:t>IEMENTech</w:t>
-      </w:r>
-      <w:proofErr w:type="spellEnd"/>
-      <w:r>
-        <w:t xml:space="preserve"> (2021)</w:t>
-      </w:r>
-    </w:p>
-    <w:p>
-      <w:pPr>
-        <w:pStyle w:val="referenceitem"/>
-      </w:pPr>
-      <w:r>
         <w:t xml:space="preserve">Liu, F.T., Ting, K.M., Zhou, Z.H.: </w:t>
       </w:r>
       <w:proofErr w:type="gramStart"/>

</xml_diff>